<commit_message>
Update project problem statement template
</commit_message>
<xml_diff>
--- a/PE6201_Project_Problem_Statement_Template(1).docx
+++ b/PE6201_Project_Problem_Statement_Template(1).docx
@@ -180,7 +180,16 @@
           <w:szCs w:val="19"/>
           <w:lang w:eastAsia="zh-CN"/>
         </w:rPr>
-        <w:t>2026.8.19</w:t>
+        <w:t>2026.8.</w:t>
+      </w:r>
+      <w:r>
+        <w:rPr>
+          <w:rFonts w:hint="eastAsia"/>
+          <w:sz w:val="19"/>
+          <w:szCs w:val="19"/>
+          <w:lang w:val="en-US" w:eastAsia="zh-CN"/>
+        </w:rPr>
+        <w:t>22</w:t>
       </w:r>
       <w:r>
         <w:rPr>
@@ -218,6 +227,191 @@
           <w:szCs w:val="16"/>
         </w:rPr>
         <w:t>A short, specific name for your project.</w:t>
+      </w:r>
+    </w:p>
+    <w:tbl>
+      <w:tblPr>
+        <w:tblStyle w:val="12"/>
+        <w:tblW w:w="9026" w:type="dxa"/>
+        <w:tblInd w:w="0" w:type="dxa"/>
+        <w:tblBorders>
+          <w:top w:val="single" w:color="auto" w:sz="4" w:space="0"/>
+          <w:left w:val="single" w:color="auto" w:sz="4" w:space="0"/>
+          <w:bottom w:val="single" w:color="auto" w:sz="4" w:space="0"/>
+          <w:right w:val="single" w:color="auto" w:sz="4" w:space="0"/>
+          <w:insideH w:val="single" w:color="auto" w:sz="4" w:space="0"/>
+          <w:insideV w:val="single" w:color="auto" w:sz="4" w:space="0"/>
+        </w:tblBorders>
+        <w:tblLayout w:type="autofit"/>
+        <w:tblCellMar>
+          <w:top w:w="0" w:type="dxa"/>
+          <w:left w:w="10" w:type="dxa"/>
+          <w:bottom w:w="0" w:type="dxa"/>
+          <w:right w:w="10" w:type="dxa"/>
+        </w:tblCellMar>
+      </w:tblPr>
+      <w:tblGrid>
+        <w:gridCol w:w="9026"/>
+      </w:tblGrid>
+      <w:tr>
+        <w:tblPrEx>
+          <w:tblBorders>
+            <w:top w:val="single" w:color="auto" w:sz="4" w:space="0"/>
+            <w:left w:val="single" w:color="auto" w:sz="4" w:space="0"/>
+            <w:bottom w:val="single" w:color="auto" w:sz="4" w:space="0"/>
+            <w:right w:val="single" w:color="auto" w:sz="4" w:space="0"/>
+            <w:insideH w:val="single" w:color="auto" w:sz="4" w:space="0"/>
+            <w:insideV w:val="single" w:color="auto" w:sz="4" w:space="0"/>
+          </w:tblBorders>
+        </w:tblPrEx>
+        <w:tc>
+          <w:tcPr>
+            <w:tcW w:w="9026" w:type="dxa"/>
+            <w:shd w:val="clear" w:color="auto" w:fill="FAFBFD"/>
+            <w:tcMar>
+              <w:top w:w="60" w:type="dxa"/>
+              <w:left w:w="120" w:type="dxa"/>
+              <w:bottom w:w="60" w:type="dxa"/>
+              <w:right w:w="120" w:type="dxa"/>
+            </w:tcMar>
+          </w:tcPr>
+          <w:p>
+            <w:pPr>
+              <w:rPr>
+                <w:rFonts w:hint="eastAsia"/>
+                <w:lang w:eastAsia="zh-CN"/>
+              </w:rPr>
+            </w:pPr>
+            <w:r>
+              <w:t>Natural Language E-Commerce Sales Analytics Platform</w:t>
+            </w:r>
+          </w:p>
+        </w:tc>
+      </w:tr>
+    </w:tbl>
+    <w:p>
+      <w:pPr>
+        <w:spacing w:before="170" w:after="20"/>
+      </w:pPr>
+      <w:r>
+        <w:rPr>
+          <w:b/>
+          <w:bCs/>
+          <w:color w:val="1F3864"/>
+          <w:sz w:val="21"/>
+          <w:szCs w:val="21"/>
+        </w:rPr>
+        <w:t>2 · The problem, and why it matters</w:t>
+      </w:r>
+      <w:bookmarkStart w:id="0" w:name="_GoBack"/>
+      <w:bookmarkEnd w:id="0"/>
+    </w:p>
+    <w:p>
+      <w:pPr>
+        <w:spacing w:after="40"/>
+      </w:pPr>
+      <w:r>
+        <w:rPr>
+          <w:i/>
+          <w:iCs/>
+          <w:color w:val="595959"/>
+          <w:sz w:val="16"/>
+          <w:szCs w:val="16"/>
+        </w:rPr>
+        <w:t>Who has this problem, and why is it worth solving? 2–3 sentences. (Rubric 1)</w:t>
+      </w:r>
+    </w:p>
+    <w:tbl>
+      <w:tblPr>
+        <w:tblStyle w:val="12"/>
+        <w:tblW w:w="9026" w:type="dxa"/>
+        <w:tblInd w:w="0" w:type="dxa"/>
+        <w:tblBorders>
+          <w:top w:val="single" w:color="auto" w:sz="4" w:space="0"/>
+          <w:left w:val="single" w:color="auto" w:sz="4" w:space="0"/>
+          <w:bottom w:val="single" w:color="auto" w:sz="4" w:space="0"/>
+          <w:right w:val="single" w:color="auto" w:sz="4" w:space="0"/>
+          <w:insideH w:val="single" w:color="auto" w:sz="4" w:space="0"/>
+          <w:insideV w:val="single" w:color="auto" w:sz="4" w:space="0"/>
+        </w:tblBorders>
+        <w:tblLayout w:type="autofit"/>
+        <w:tblCellMar>
+          <w:top w:w="0" w:type="dxa"/>
+          <w:left w:w="10" w:type="dxa"/>
+          <w:bottom w:w="0" w:type="dxa"/>
+          <w:right w:w="10" w:type="dxa"/>
+        </w:tblCellMar>
+      </w:tblPr>
+      <w:tblGrid>
+        <w:gridCol w:w="9026"/>
+      </w:tblGrid>
+      <w:tr>
+        <w:tblPrEx>
+          <w:tblBorders>
+            <w:top w:val="single" w:color="auto" w:sz="4" w:space="0"/>
+            <w:left w:val="single" w:color="auto" w:sz="4" w:space="0"/>
+            <w:bottom w:val="single" w:color="auto" w:sz="4" w:space="0"/>
+            <w:right w:val="single" w:color="auto" w:sz="4" w:space="0"/>
+            <w:insideH w:val="single" w:color="auto" w:sz="4" w:space="0"/>
+            <w:insideV w:val="single" w:color="auto" w:sz="4" w:space="0"/>
+          </w:tblBorders>
+          <w:tblCellMar>
+            <w:top w:w="0" w:type="dxa"/>
+            <w:left w:w="10" w:type="dxa"/>
+            <w:bottom w:w="0" w:type="dxa"/>
+            <w:right w:w="10" w:type="dxa"/>
+          </w:tblCellMar>
+        </w:tblPrEx>
+        <w:tc>
+          <w:tcPr>
+            <w:tcW w:w="9026" w:type="dxa"/>
+            <w:shd w:val="clear" w:color="auto" w:fill="FAFBFD"/>
+            <w:tcMar>
+              <w:top w:w="60" w:type="dxa"/>
+              <w:left w:w="120" w:type="dxa"/>
+              <w:bottom w:w="60" w:type="dxa"/>
+              <w:right w:w="120" w:type="dxa"/>
+            </w:tcMar>
+          </w:tcPr>
+          <w:p>
+            <w:r>
+              <w:rPr>
+                <w:lang w:val="en-US" w:eastAsia="zh-CN"/>
+              </w:rPr>
+              <w:t xml:space="preserve">Traditional data analysis on e-commerce platforms typically requires analysts to manually write SQL queries for key metrics, which is technically demanding and time-consuming. Meanwhile, rigid Power BI dashboards within departments limit query flexibility. AI can improve data analysis efficiency. </w:t>
+            </w:r>
+          </w:p>
+        </w:tc>
+      </w:tr>
+    </w:tbl>
+    <w:p>
+      <w:pPr>
+        <w:spacing w:before="170" w:after="20"/>
+      </w:pPr>
+      <w:r>
+        <w:rPr>
+          <w:b/>
+          <w:bCs/>
+          <w:color w:val="1F3864"/>
+          <w:sz w:val="21"/>
+          <w:szCs w:val="21"/>
+        </w:rPr>
+        <w:t>3 · Who it’s for, and the domain</w:t>
+      </w:r>
+    </w:p>
+    <w:p>
+      <w:pPr>
+        <w:spacing w:after="40"/>
+      </w:pPr>
+      <w:r>
+        <w:rPr>
+          <w:i/>
+          <w:iCs/>
+          <w:color w:val="595959"/>
+          <w:sz w:val="16"/>
+          <w:szCs w:val="16"/>
+        </w:rPr>
+        <w:t>Your user / audience and the industry (e.g. banking, healthcare, retail, your employer).</w:t>
       </w:r>
     </w:p>
     <w:tbl>
@@ -275,12 +469,56 @@
           <w:p>
             <w:pPr>
               <w:rPr>
+                <w:rFonts w:hint="default" w:eastAsiaTheme="minorEastAsia"/>
+                <w:lang w:val="en-US" w:eastAsia="zh-CN"/>
+              </w:rPr>
+            </w:pPr>
+            <w:r>
+              <w:rPr>
                 <w:rFonts w:hint="eastAsia"/>
-                <w:lang w:eastAsia="zh-CN"/>
-              </w:rPr>
-            </w:pPr>
-            <w:r>
-              <w:t>Natural Language E-Commerce Sales Analytics Platform</w:t>
+                <w:lang w:val="en-US" w:eastAsia="zh-CN"/>
+              </w:rPr>
+              <w:t>The client who doesn</w:t>
+            </w:r>
+            <w:r>
+              <w:rPr>
+                <w:rFonts w:hint="default"/>
+                <w:lang w:val="en-US" w:eastAsia="zh-CN"/>
+              </w:rPr>
+              <w:t>’</w:t>
+            </w:r>
+            <w:r>
+              <w:rPr>
+                <w:rFonts w:hint="eastAsia"/>
+                <w:lang w:val="en-US" w:eastAsia="zh-CN"/>
+              </w:rPr>
+              <w:t xml:space="preserve">t want to hire a </w:t>
+            </w:r>
+            <w:r>
+              <w:t xml:space="preserve">business analyst </w:t>
+            </w:r>
+            <w:r>
+              <w:rPr>
+                <w:rFonts w:hint="eastAsia"/>
+                <w:lang w:val="en-US" w:eastAsia="zh-CN"/>
+              </w:rPr>
+              <w:t xml:space="preserve">or build own data analytics department </w:t>
+            </w:r>
+            <w:r>
+              <w:t>in e</w:t>
+            </w:r>
+            <w:r>
+              <w:noBreakHyphen/>
+            </w:r>
+            <w:r>
+              <w:t>commerce retail</w:t>
+            </w:r>
+            <w:r>
+              <w:rPr>
+                <w:rFonts w:hint="eastAsia"/>
+                <w:lang w:val="en-US" w:eastAsia="zh-CN"/>
+              </w:rPr>
+              <w:t xml:space="preserve"> field. </w:t>
             </w:r>
           </w:p>
         </w:tc>
@@ -298,7 +536,7 @@
           <w:sz w:val="21"/>
           <w:szCs w:val="21"/>
         </w:rPr>
-        <w:t>2 · The problem, and why it matters</w:t>
+        <w:t xml:space="preserve">4 · Why AI — and which kind? Remember, from class 1 workshops, no one size fits all </w:t>
       </w:r>
     </w:p>
     <w:p>
@@ -313,7 +551,7 @@
           <w:sz w:val="16"/>
           <w:szCs w:val="16"/>
         </w:rPr>
-        <w:t>Who has this problem, and why is it worth solving? 2–3 sentences. (Rubric 1)</w:t>
+        <w:t>Is AI the right tool here (vs a rule or lookup)? If yes, which type — narrow ML, a foundation model, RAG, an agent? (ILO 1)</w:t>
       </w:r>
     </w:p>
     <w:tbl>
@@ -373,7 +611,7 @@
               <w:rPr>
                 <w:lang w:val="en-US" w:eastAsia="zh-CN"/>
               </w:rPr>
-              <w:t xml:space="preserve">Traditional data analysis on e-commerce platforms typically requires analysts to manually write SQL queries for key metrics, which is technically demanding and time-consuming. Meanwhile, rigid Power BI dashboards within departments limit query flexibility. AI can improve data analysis efficiency. </w:t>
+              <w:t xml:space="preserve">Since the user input is unstructured text, LLM must be used for transformation. Additionally, the open-source Vanna AI framework is incorporated to improve the accuracy of natural language to SQL statement conversion. </w:t>
             </w:r>
           </w:p>
         </w:tc>
@@ -391,7 +629,7 @@
           <w:sz w:val="21"/>
           <w:szCs w:val="21"/>
         </w:rPr>
-        <w:t>3 · Who it’s for, and the domain</w:t>
+        <w:t>5 · Proposed approach — build vs buy or both!</w:t>
       </w:r>
     </w:p>
     <w:p>
@@ -406,7 +644,7 @@
           <w:sz w:val="16"/>
           <w:szCs w:val="16"/>
         </w:rPr>
-        <w:t>Your user / audience and the industry (e.g. banking, healthcare, retail, your employer).</w:t>
+        <w:t>What will you build (low-code and/or code)? Which layers will you own vs rent, and why? (Rubric 2, ILO 3)</w:t>
       </w:r>
     </w:p>
     <w:tbl>
@@ -464,56 +702,73 @@
           <w:p>
             <w:pPr>
               <w:rPr>
-                <w:rFonts w:hint="default" w:eastAsiaTheme="minorEastAsia"/>
                 <w:lang w:val="en-US" w:eastAsia="zh-CN"/>
               </w:rPr>
             </w:pPr>
             <w:r>
               <w:rPr>
+                <w:lang w:val="en-US"/>
+              </w:rPr>
+              <w:t>Code (</w:t>
+            </w:r>
+            <w:r>
+              <w:rPr>
                 <w:rFonts w:hint="eastAsia"/>
                 <w:lang w:val="en-US" w:eastAsia="zh-CN"/>
               </w:rPr>
-              <w:t>The client who doesn</w:t>
-            </w:r>
-            <w:r>
-              <w:rPr>
-                <w:rFonts w:hint="default"/>
-                <w:lang w:val="en-US" w:eastAsia="zh-CN"/>
-              </w:rPr>
-              <w:t>’</w:t>
-            </w:r>
-            <w:r>
-              <w:rPr>
-                <w:rFonts w:hint="eastAsia"/>
-                <w:lang w:val="en-US" w:eastAsia="zh-CN"/>
-              </w:rPr>
-              <w:t xml:space="preserve">t want to hire a </w:t>
-            </w:r>
-            <w:r>
-              <w:t xml:space="preserve">business analyst </w:t>
-            </w:r>
-            <w:r>
-              <w:rPr>
-                <w:rFonts w:hint="eastAsia"/>
-                <w:lang w:val="en-US" w:eastAsia="zh-CN"/>
-              </w:rPr>
-              <w:t xml:space="preserve">or build own data analytics department </w:t>
-            </w:r>
-            <w:r>
-              <w:t>in e</w:t>
-            </w:r>
-            <w:r>
-              <w:noBreakHyphen/>
-            </w:r>
-            <w:r>
-              <w:t>commerce retail</w:t>
-            </w:r>
-            <w:r>
-              <w:rPr>
-                <w:rFonts w:hint="eastAsia"/>
-                <w:lang w:val="en-US" w:eastAsia="zh-CN"/>
-              </w:rPr>
-              <w:t xml:space="preserve"> field. </w:t>
+              <w:t xml:space="preserve"> </w:t>
+            </w:r>
+            <w:r>
+              <w:rPr>
+                <w:lang w:val="en-US" w:eastAsia="zh-CN"/>
+              </w:rPr>
+              <w:t>but mainly generated by LLM )</w:t>
+            </w:r>
+          </w:p>
+          <w:p>
+            <w:r>
+              <w:rPr>
+                <w:lang w:val="en-US" w:eastAsia="zh-CN"/>
+              </w:rPr>
+              <w:t xml:space="preserve">Rent: compute </w:t>
+            </w:r>
+            <w:r>
+              <w:t>Data + embedding Vector store Model Serving</w:t>
+            </w:r>
+          </w:p>
+          <w:p>
+            <w:pPr>
+              <w:rPr>
+                <w:lang w:val="en-US" w:eastAsia="ja-JP"/>
+              </w:rPr>
+            </w:pPr>
+            <w:r>
+              <w:rPr>
+                <w:lang w:val="en-US" w:eastAsia="zh-CN"/>
+              </w:rPr>
+              <w:t xml:space="preserve">Build: Orchestration </w:t>
+            </w:r>
+            <w:r>
+              <w:rPr>
+                <w:lang w:val="en-US" w:eastAsia="ja-JP"/>
+              </w:rPr>
+              <w:t>evals</w:t>
+            </w:r>
+          </w:p>
+          <w:p>
+            <w:pPr>
+              <w:rPr>
+                <w:lang w:val="en-US" w:eastAsia="ja-JP"/>
+              </w:rPr>
+            </w:pPr>
+            <w:r>
+              <w:rPr>
+                <w:lang w:val="en-US" w:eastAsia="ja-JP"/>
+              </w:rPr>
+              <w:t>I couldn’t afford these h</w:t>
+            </w:r>
+            <w:r>
+              <w:t>eavy infrastructure layers</w:t>
             </w:r>
           </w:p>
         </w:tc>
@@ -531,7 +786,7 @@
           <w:sz w:val="21"/>
           <w:szCs w:val="21"/>
         </w:rPr>
-        <w:t xml:space="preserve">4 · Why AI — and which kind? Remember, from class 1 workshops, no one size fits all </w:t>
+        <w:t xml:space="preserve">6 · Data – this packs the intelligence ! </w:t>
       </w:r>
     </w:p>
     <w:p>
@@ -546,100 +801,7 @@
           <w:sz w:val="16"/>
           <w:szCs w:val="16"/>
         </w:rPr>
-        <w:t>Is AI the right tool here (vs a rule or lookup)? If yes, which type — narrow ML, a foundation model, RAG, an agent? (ILO 1)</w:t>
-      </w:r>
-    </w:p>
-    <w:tbl>
-      <w:tblPr>
-        <w:tblStyle w:val="12"/>
-        <w:tblW w:w="9026" w:type="dxa"/>
-        <w:tblInd w:w="0" w:type="dxa"/>
-        <w:tblBorders>
-          <w:top w:val="single" w:color="auto" w:sz="4" w:space="0"/>
-          <w:left w:val="single" w:color="auto" w:sz="4" w:space="0"/>
-          <w:bottom w:val="single" w:color="auto" w:sz="4" w:space="0"/>
-          <w:right w:val="single" w:color="auto" w:sz="4" w:space="0"/>
-          <w:insideH w:val="single" w:color="auto" w:sz="4" w:space="0"/>
-          <w:insideV w:val="single" w:color="auto" w:sz="4" w:space="0"/>
-        </w:tblBorders>
-        <w:tblLayout w:type="autofit"/>
-        <w:tblCellMar>
-          <w:top w:w="0" w:type="dxa"/>
-          <w:left w:w="10" w:type="dxa"/>
-          <w:bottom w:w="0" w:type="dxa"/>
-          <w:right w:w="10" w:type="dxa"/>
-        </w:tblCellMar>
-      </w:tblPr>
-      <w:tblGrid>
-        <w:gridCol w:w="9026"/>
-      </w:tblGrid>
-      <w:tr>
-        <w:tblPrEx>
-          <w:tblBorders>
-            <w:top w:val="single" w:color="auto" w:sz="4" w:space="0"/>
-            <w:left w:val="single" w:color="auto" w:sz="4" w:space="0"/>
-            <w:bottom w:val="single" w:color="auto" w:sz="4" w:space="0"/>
-            <w:right w:val="single" w:color="auto" w:sz="4" w:space="0"/>
-            <w:insideH w:val="single" w:color="auto" w:sz="4" w:space="0"/>
-            <w:insideV w:val="single" w:color="auto" w:sz="4" w:space="0"/>
-          </w:tblBorders>
-          <w:tblCellMar>
-            <w:top w:w="0" w:type="dxa"/>
-            <w:left w:w="10" w:type="dxa"/>
-            <w:bottom w:w="0" w:type="dxa"/>
-            <w:right w:w="10" w:type="dxa"/>
-          </w:tblCellMar>
-        </w:tblPrEx>
-        <w:tc>
-          <w:tcPr>
-            <w:tcW w:w="9026" w:type="dxa"/>
-            <w:shd w:val="clear" w:color="auto" w:fill="FAFBFD"/>
-            <w:tcMar>
-              <w:top w:w="60" w:type="dxa"/>
-              <w:left w:w="120" w:type="dxa"/>
-              <w:bottom w:w="60" w:type="dxa"/>
-              <w:right w:w="120" w:type="dxa"/>
-            </w:tcMar>
-          </w:tcPr>
-          <w:p>
-            <w:r>
-              <w:rPr>
-                <w:lang w:val="en-US" w:eastAsia="zh-CN"/>
-              </w:rPr>
-              <w:t xml:space="preserve">Since the user input is unstructured text, LLM must be used for transformation. Additionally, the open-source Vanna AI framework is incorporated to improve the accuracy of natural language to SQL statement conversion. </w:t>
-            </w:r>
-          </w:p>
-        </w:tc>
-      </w:tr>
-    </w:tbl>
-    <w:p>
-      <w:pPr>
-        <w:spacing w:before="170" w:after="20"/>
-      </w:pPr>
-      <w:r>
-        <w:rPr>
-          <w:b/>
-          <w:bCs/>
-          <w:color w:val="1F3864"/>
-          <w:sz w:val="21"/>
-          <w:szCs w:val="21"/>
-        </w:rPr>
-        <w:t>5 · Proposed approach — build vs buy or both!</w:t>
-      </w:r>
-    </w:p>
-    <w:p>
-      <w:pPr>
-        <w:spacing w:after="40"/>
-      </w:pPr>
-      <w:r>
-        <w:rPr>
-          <w:i/>
-          <w:iCs/>
-          <w:color w:val="595959"/>
-          <w:sz w:val="16"/>
-          <w:szCs w:val="16"/>
-        </w:rPr>
-        <w:t>What will you build (low-code and/or code)? Which layers will you own vs rent, and why? (Rubric 2, ILO 3)</w:t>
+        <w:t>What data do you need, where from, and any access / privacy / residency constraints?</w:t>
       </w:r>
     </w:p>
     <w:tbl>
@@ -697,73 +859,36 @@
           <w:p>
             <w:pPr>
               <w:rPr>
+                <w:rFonts w:hint="default"/>
                 <w:lang w:val="en-US" w:eastAsia="zh-CN"/>
               </w:rPr>
             </w:pPr>
             <w:r>
               <w:rPr>
-                <w:lang w:val="en-US"/>
-              </w:rPr>
-              <w:t>Code (</w:t>
+                <w:lang w:val="en-US" w:eastAsia="zh-CN"/>
+              </w:rPr>
+              <w:t>In the test stage it will use the Open-source Global E-Commerce Sales Analysis dataset from Kaggle</w:t>
             </w:r>
             <w:r>
               <w:rPr>
                 <w:rFonts w:hint="eastAsia"/>
                 <w:lang w:val="en-US" w:eastAsia="zh-CN"/>
               </w:rPr>
-              <w:t xml:space="preserve"> </w:t>
-            </w:r>
-            <w:r>
-              <w:rPr>
-                <w:lang w:val="en-US" w:eastAsia="zh-CN"/>
-              </w:rPr>
-              <w:t>but mainly generated by LLM )</w:t>
-            </w:r>
-          </w:p>
-          <w:p>
-            <w:r>
-              <w:rPr>
-                <w:lang w:val="en-US" w:eastAsia="zh-CN"/>
-              </w:rPr>
-              <w:t xml:space="preserve">Rent: compute </w:t>
-            </w:r>
-            <w:r>
-              <w:t>Data + embedding Vector store Model Serving</w:t>
+              <w:t xml:space="preserve"> without any limits in security.</w:t>
             </w:r>
           </w:p>
           <w:p>
             <w:pPr>
               <w:rPr>
-                <w:lang w:val="en-US" w:eastAsia="ja-JP"/>
+                <w:lang w:val="en-US"/>
               </w:rPr>
             </w:pPr>
             <w:r>
               <w:rPr>
-                <w:lang w:val="en-US" w:eastAsia="zh-CN"/>
-              </w:rPr>
-              <w:t xml:space="preserve">Build: Orchestration </w:t>
-            </w:r>
-            <w:r>
-              <w:rPr>
-                <w:lang w:val="en-US" w:eastAsia="ja-JP"/>
-              </w:rPr>
-              <w:t>evals</w:t>
-            </w:r>
-          </w:p>
-          <w:p>
-            <w:pPr>
-              <w:rPr>
-                <w:lang w:val="en-US" w:eastAsia="ja-JP"/>
-              </w:rPr>
-            </w:pPr>
-            <w:r>
-              <w:rPr>
-                <w:lang w:val="en-US" w:eastAsia="ja-JP"/>
-              </w:rPr>
-              <w:t>I couldn’t afford these h</w:t>
-            </w:r>
-            <w:r>
-              <w:t>eavy infrastructure layers</w:t>
+                <w:rFonts w:hint="eastAsia"/>
+                <w:lang w:val="en-US"/>
+              </w:rPr>
+              <w:t>https://www.kaggle.com/datasets/bibirehana/global-e-commarce-sales-data-analysis</w:t>
             </w:r>
           </w:p>
         </w:tc>
@@ -781,7 +906,7 @@
           <w:sz w:val="21"/>
           <w:szCs w:val="21"/>
         </w:rPr>
-        <w:t xml:space="preserve">6 · Data – this packs the intelligence ! </w:t>
+        <w:t>7 · Success metric &amp; how you’ll evaluate it</w:t>
       </w:r>
     </w:p>
     <w:p>
@@ -796,7 +921,196 @@
           <w:sz w:val="16"/>
           <w:szCs w:val="16"/>
         </w:rPr>
-        <w:t>What data do you need, where from, and any access / privacy / residency constraints?</w:t>
+        <w:t>One metric that ties to real value, and one check (an eval) you could actually run. (evals thread)</w:t>
+      </w:r>
+    </w:p>
+    <w:tbl>
+      <w:tblPr>
+        <w:tblStyle w:val="12"/>
+        <w:tblW w:w="9026" w:type="dxa"/>
+        <w:tblInd w:w="0" w:type="dxa"/>
+        <w:tblBorders>
+          <w:top w:val="single" w:color="auto" w:sz="4" w:space="0"/>
+          <w:left w:val="single" w:color="auto" w:sz="4" w:space="0"/>
+          <w:bottom w:val="single" w:color="auto" w:sz="4" w:space="0"/>
+          <w:right w:val="single" w:color="auto" w:sz="4" w:space="0"/>
+          <w:insideH w:val="single" w:color="auto" w:sz="4" w:space="0"/>
+          <w:insideV w:val="single" w:color="auto" w:sz="4" w:space="0"/>
+        </w:tblBorders>
+        <w:tblLayout w:type="autofit"/>
+        <w:tblCellMar>
+          <w:top w:w="0" w:type="dxa"/>
+          <w:left w:w="10" w:type="dxa"/>
+          <w:bottom w:w="0" w:type="dxa"/>
+          <w:right w:w="10" w:type="dxa"/>
+        </w:tblCellMar>
+      </w:tblPr>
+      <w:tblGrid>
+        <w:gridCol w:w="9026"/>
+      </w:tblGrid>
+      <w:tr>
+        <w:tblPrEx>
+          <w:tblBorders>
+            <w:top w:val="single" w:color="auto" w:sz="4" w:space="0"/>
+            <w:left w:val="single" w:color="auto" w:sz="4" w:space="0"/>
+            <w:bottom w:val="single" w:color="auto" w:sz="4" w:space="0"/>
+            <w:right w:val="single" w:color="auto" w:sz="4" w:space="0"/>
+            <w:insideH w:val="single" w:color="auto" w:sz="4" w:space="0"/>
+            <w:insideV w:val="single" w:color="auto" w:sz="4" w:space="0"/>
+          </w:tblBorders>
+          <w:tblCellMar>
+            <w:top w:w="0" w:type="dxa"/>
+            <w:left w:w="10" w:type="dxa"/>
+            <w:bottom w:w="0" w:type="dxa"/>
+            <w:right w:w="10" w:type="dxa"/>
+          </w:tblCellMar>
+        </w:tblPrEx>
+        <w:tc>
+          <w:tcPr>
+            <w:tcW w:w="9026" w:type="dxa"/>
+            <w:shd w:val="clear" w:color="auto" w:fill="FAFBFD"/>
+            <w:tcMar>
+              <w:top w:w="60" w:type="dxa"/>
+              <w:left w:w="120" w:type="dxa"/>
+              <w:bottom w:w="60" w:type="dxa"/>
+              <w:right w:w="120" w:type="dxa"/>
+            </w:tcMar>
+          </w:tcPr>
+          <w:p>
+            <w:r>
+              <w:t>Query-to-Insight task execution accuracy without requiring manual SQL fixes, and generate the correct data graph pan</w:t>
+            </w:r>
+            <w:r>
+              <w:rPr>
+                <w:rFonts w:hint="eastAsia"/>
+                <w:lang w:val="en-US" w:eastAsia="zh-CN"/>
+              </w:rPr>
+              <w:t>e</w:t>
+            </w:r>
+            <w:r>
+              <w:t>l.</w:t>
+            </w:r>
+          </w:p>
+          <w:p>
+            <w:pPr>
+              <w:rPr>
+                <w:rFonts w:hint="eastAsia"/>
+                <w:lang w:val="en-US" w:eastAsia="zh-CN"/>
+              </w:rPr>
+            </w:pPr>
+            <w:r>
+              <w:t>Execution Accuracy  benchmark across 20 pre-defined complex natural language analytical questions compared against ground-truth SQL results</w:t>
+            </w:r>
+            <w:r>
+              <w:rPr>
+                <w:rFonts w:hint="eastAsia"/>
+                <w:lang w:val="en-US" w:eastAsia="zh-CN"/>
+              </w:rPr>
+              <w:t>.</w:t>
+            </w:r>
+          </w:p>
+          <w:p>
+            <w:pPr>
+              <w:rPr>
+                <w:rFonts w:hint="default"/>
+                <w:lang w:val="en-US" w:eastAsia="zh-CN"/>
+              </w:rPr>
+            </w:pPr>
+            <w:r>
+              <w:rPr>
+                <w:rFonts w:hint="eastAsia"/>
+                <w:lang w:val="en-US" w:eastAsia="zh-CN"/>
+              </w:rPr>
+              <w:t>Baseline to beat: Raw LLM NL</w:t>
+            </w:r>
+            <w:r>
+              <w:rPr>
+                <w:rFonts w:hint="eastAsia"/>
+                <w:lang w:val="en-US" w:eastAsia="zh-CN"/>
+              </w:rPr>
+              <w:noBreakHyphen/>
+            </w:r>
+            <w:r>
+              <w:rPr>
+                <w:rFonts w:hint="eastAsia"/>
+                <w:lang w:val="en-US" w:eastAsia="zh-CN"/>
+              </w:rPr>
+              <w:t>to</w:t>
+            </w:r>
+            <w:r>
+              <w:rPr>
+                <w:rFonts w:hint="eastAsia"/>
+                <w:lang w:val="en-US" w:eastAsia="zh-CN"/>
+              </w:rPr>
+              <w:noBreakHyphen/>
+            </w:r>
+            <w:r>
+              <w:rPr>
+                <w:rFonts w:hint="eastAsia"/>
+                <w:lang w:val="en-US" w:eastAsia="zh-CN"/>
+              </w:rPr>
+              <w:t>SQL outputs without providing database schema context. This naive approach is expected to produce low valid</w:t>
+            </w:r>
+            <w:r>
+              <w:rPr>
+                <w:rFonts w:hint="eastAsia"/>
+                <w:lang w:val="en-US" w:eastAsia="zh-CN"/>
+              </w:rPr>
+              <w:noBreakHyphen/>
+            </w:r>
+            <w:r>
+              <w:rPr>
+                <w:rFonts w:hint="eastAsia"/>
+                <w:lang w:val="en-US" w:eastAsia="zh-CN"/>
+              </w:rPr>
+              <w:t>SQL execution accuracy and time consuming. My goal is to outperform this naive LLM baseline when schema context and Vanna retrieval</w:t>
+            </w:r>
+            <w:r>
+              <w:rPr>
+                <w:rFonts w:hint="eastAsia"/>
+                <w:lang w:val="en-US" w:eastAsia="zh-CN"/>
+              </w:rPr>
+              <w:noBreakHyphen/>
+            </w:r>
+            <w:r>
+              <w:rPr>
+                <w:rFonts w:hint="eastAsia"/>
+                <w:lang w:val="en-US" w:eastAsia="zh-CN"/>
+              </w:rPr>
+              <w:t>augmented generation are enabled. (Currently the benchmark is unknown)</w:t>
+            </w:r>
+          </w:p>
+        </w:tc>
+      </w:tr>
+    </w:tbl>
+    <w:p>
+      <w:pPr>
+        <w:spacing w:before="170" w:after="20"/>
+      </w:pPr>
+      <w:r>
+        <w:rPr>
+          <w:b/>
+          <w:bCs/>
+          <w:color w:val="1F3864"/>
+          <w:sz w:val="21"/>
+          <w:szCs w:val="21"/>
+        </w:rPr>
+        <w:t>8 · Risks, limitations &amp; responsible use</w:t>
+      </w:r>
+    </w:p>
+    <w:p>
+      <w:pPr>
+        <w:spacing w:after="40"/>
+      </w:pPr>
+      <w:r>
+        <w:rPr>
+          <w:i/>
+          <w:iCs/>
+          <w:color w:val="595959"/>
+          <w:sz w:val="16"/>
+          <w:szCs w:val="16"/>
+        </w:rPr>
+        <w:t>What could go wrong (incl. silent failure), and who might it affect?</w:t>
       </w:r>
     </w:p>
     <w:tbl>
@@ -854,36 +1168,59 @@
           <w:p>
             <w:pPr>
               <w:rPr>
-                <w:rFonts w:hint="default"/>
-                <w:lang w:val="en-US" w:eastAsia="zh-CN"/>
+                <w:lang w:eastAsia="zh-CN"/>
               </w:rPr>
             </w:pPr>
             <w:r>
               <w:rPr>
-                <w:lang w:val="en-US" w:eastAsia="zh-CN"/>
-              </w:rPr>
-              <w:t>In the test stage it will use the Open-source Global E-Commerce Sales Analysis dataset from Kaggle</w:t>
-            </w:r>
-            <w:r>
-              <w:rPr>
-                <w:rFonts w:hint="eastAsia"/>
-                <w:lang w:val="en-US" w:eastAsia="zh-CN"/>
-              </w:rPr>
-              <w:t xml:space="preserve"> without any limits in security.</w:t>
+                <w:lang w:eastAsia="zh-CN"/>
+              </w:rPr>
+              <w:t>Risk 1: LLM hallucinations and business</w:t>
+            </w:r>
+            <w:r>
+              <w:rPr>
+                <w:lang w:eastAsia="zh-CN"/>
+              </w:rPr>
+              <w:noBreakHyphen/>
+            </w:r>
+            <w:r>
+              <w:rPr>
+                <w:lang w:eastAsia="zh-CN"/>
+              </w:rPr>
+              <w:t>logic misunderstanding, producing factually wrong SQL. Mitigation: Add schema retrieval guardrails; validate generated SQL against basic syntax checks before execution.</w:t>
             </w:r>
           </w:p>
           <w:p>
             <w:pPr>
               <w:rPr>
-                <w:lang w:val="en-US"/>
+                <w:lang w:eastAsia="zh-CN"/>
               </w:rPr>
             </w:pPr>
             <w:r>
               <w:rPr>
-                <w:rFonts w:hint="eastAsia"/>
-                <w:lang w:val="en-US"/>
-              </w:rPr>
-              <w:t>https://www.kaggle.com/datasets/bibirehana/global-e-commarce-sales-data-analysis</w:t>
+                <w:lang w:eastAsia="zh-CN"/>
+              </w:rPr>
+              <w:t>Risk 2: Incorrect chart panel generation that misrepresents analytical results. Mitigation: Restrict chart types to a small predefined set for this prototype.</w:t>
+            </w:r>
+          </w:p>
+          <w:p>
+            <w:r>
+              <w:rPr>
+                <w:lang w:eastAsia="zh-CN"/>
+              </w:rPr>
+              <w:t>Limitation: This prototype is only validated on the selected Kaggle e</w:t>
+            </w:r>
+            <w:r>
+              <w:rPr>
+                <w:lang w:eastAsia="zh-CN"/>
+              </w:rPr>
+              <w:noBreakHyphen/>
+            </w:r>
+            <w:r>
+              <w:rPr>
+                <w:lang w:eastAsia="zh-CN"/>
+              </w:rPr>
+              <w:t>commerce dataset; performance will degrade when ported to unfamiliar databases.</w:t>
             </w:r>
           </w:p>
         </w:tc>
@@ -901,7 +1238,7 @@
           <w:sz w:val="21"/>
           <w:szCs w:val="21"/>
         </w:rPr>
-        <w:t>7 · Success metric &amp; how you’ll evaluate it</w:t>
+        <w:t>9 · Smallest first version (optional)</w:t>
       </w:r>
     </w:p>
     <w:p>
@@ -916,7 +1253,7 @@
           <w:sz w:val="16"/>
           <w:szCs w:val="16"/>
         </w:rPr>
-        <w:t>One metric that ties to real value, and one check (an eval) you could actually run. (evals thread)</w:t>
+        <w:t>The tiniest end-to-end slice you could build first.</w:t>
       </w:r>
     </w:p>
     <w:tbl>
@@ -973,337 +1310,12 @@
           </w:tcPr>
           <w:p>
             <w:r>
-              <w:t>Query-to-Insight task execution accuracy without requiring manual SQL fixes, and generate the correct data graph pan</w:t>
-            </w:r>
-            <w:r>
               <w:rPr>
                 <w:rFonts w:hint="eastAsia"/>
-                <w:lang w:val="en-US" w:eastAsia="zh-CN"/>
-              </w:rPr>
-              <w:t>e</w:t>
-            </w:r>
-            <w:r>
-              <w:t>l.</w:t>
+              </w:rPr>
+              <w:t>https://github.com/1194837305/PE6201_individual</w:t>
             </w:r>
           </w:p>
-          <w:p>
-            <w:pPr>
-              <w:rPr>
-                <w:rFonts w:hint="eastAsia"/>
-                <w:lang w:val="en-US" w:eastAsia="zh-CN"/>
-              </w:rPr>
-            </w:pPr>
-            <w:r>
-              <w:t>Execution Accuracy  benchmark across 20 pre-defined complex natural language analytical questions compared against ground-truth SQL results</w:t>
-            </w:r>
-            <w:r>
-              <w:rPr>
-                <w:rFonts w:hint="eastAsia"/>
-                <w:lang w:val="en-US" w:eastAsia="zh-CN"/>
-              </w:rPr>
-              <w:t>.</w:t>
-            </w:r>
-          </w:p>
-          <w:p>
-            <w:pPr>
-              <w:rPr>
-                <w:rFonts w:hint="default"/>
-                <w:lang w:val="en-US" w:eastAsia="zh-CN"/>
-              </w:rPr>
-            </w:pPr>
-            <w:r>
-              <w:rPr>
-                <w:rFonts w:hint="eastAsia"/>
-                <w:lang w:val="en-US" w:eastAsia="zh-CN"/>
-              </w:rPr>
-              <w:t>Baseline to beat: Raw LLM NL</w:t>
-            </w:r>
-            <w:r>
-              <w:rPr>
-                <w:rFonts w:hint="eastAsia"/>
-                <w:lang w:val="en-US" w:eastAsia="zh-CN"/>
-              </w:rPr>
-              <w:noBreakHyphen/>
-            </w:r>
-            <w:r>
-              <w:rPr>
-                <w:rFonts w:hint="eastAsia"/>
-                <w:lang w:val="en-US" w:eastAsia="zh-CN"/>
-              </w:rPr>
-              <w:t>to</w:t>
-            </w:r>
-            <w:r>
-              <w:rPr>
-                <w:rFonts w:hint="eastAsia"/>
-                <w:lang w:val="en-US" w:eastAsia="zh-CN"/>
-              </w:rPr>
-              <w:noBreakHyphen/>
-            </w:r>
-            <w:r>
-              <w:rPr>
-                <w:rFonts w:hint="eastAsia"/>
-                <w:lang w:val="en-US" w:eastAsia="zh-CN"/>
-              </w:rPr>
-              <w:t>SQL outputs without providing database schema context. This naive approach is expected to produce low valid</w:t>
-            </w:r>
-            <w:r>
-              <w:rPr>
-                <w:rFonts w:hint="eastAsia"/>
-                <w:lang w:val="en-US" w:eastAsia="zh-CN"/>
-              </w:rPr>
-              <w:noBreakHyphen/>
-            </w:r>
-            <w:r>
-              <w:rPr>
-                <w:rFonts w:hint="eastAsia"/>
-                <w:lang w:val="en-US" w:eastAsia="zh-CN"/>
-              </w:rPr>
-              <w:t>SQL execution accuracy and time consuming. My goal is to outperform this naive LLM baseline when schema context and Vanna retrieval</w:t>
-            </w:r>
-            <w:r>
-              <w:rPr>
-                <w:rFonts w:hint="eastAsia"/>
-                <w:lang w:val="en-US" w:eastAsia="zh-CN"/>
-              </w:rPr>
-              <w:noBreakHyphen/>
-            </w:r>
-            <w:r>
-              <w:rPr>
-                <w:rFonts w:hint="eastAsia"/>
-                <w:lang w:val="en-US" w:eastAsia="zh-CN"/>
-              </w:rPr>
-              <w:t>augmented generation are enabled. (Currently the benchmark is unknown)</w:t>
-            </w:r>
-          </w:p>
-        </w:tc>
-      </w:tr>
-    </w:tbl>
-    <w:p>
-      <w:pPr>
-        <w:spacing w:before="170" w:after="20"/>
-      </w:pPr>
-      <w:r>
-        <w:rPr>
-          <w:b/>
-          <w:bCs/>
-          <w:color w:val="1F3864"/>
-          <w:sz w:val="21"/>
-          <w:szCs w:val="21"/>
-        </w:rPr>
-        <w:t>8 · Risks, limitations &amp; responsible use</w:t>
-      </w:r>
-    </w:p>
-    <w:p>
-      <w:pPr>
-        <w:spacing w:after="40"/>
-      </w:pPr>
-      <w:r>
-        <w:rPr>
-          <w:i/>
-          <w:iCs/>
-          <w:color w:val="595959"/>
-          <w:sz w:val="16"/>
-          <w:szCs w:val="16"/>
-        </w:rPr>
-        <w:t>What could go wrong (incl. silent failure), and who might it affect?</w:t>
-      </w:r>
-    </w:p>
-    <w:tbl>
-      <w:tblPr>
-        <w:tblStyle w:val="12"/>
-        <w:tblW w:w="9026" w:type="dxa"/>
-        <w:tblInd w:w="0" w:type="dxa"/>
-        <w:tblBorders>
-          <w:top w:val="single" w:color="auto" w:sz="4" w:space="0"/>
-          <w:left w:val="single" w:color="auto" w:sz="4" w:space="0"/>
-          <w:bottom w:val="single" w:color="auto" w:sz="4" w:space="0"/>
-          <w:right w:val="single" w:color="auto" w:sz="4" w:space="0"/>
-          <w:insideH w:val="single" w:color="auto" w:sz="4" w:space="0"/>
-          <w:insideV w:val="single" w:color="auto" w:sz="4" w:space="0"/>
-        </w:tblBorders>
-        <w:tblLayout w:type="autofit"/>
-        <w:tblCellMar>
-          <w:top w:w="0" w:type="dxa"/>
-          <w:left w:w="10" w:type="dxa"/>
-          <w:bottom w:w="0" w:type="dxa"/>
-          <w:right w:w="10" w:type="dxa"/>
-        </w:tblCellMar>
-      </w:tblPr>
-      <w:tblGrid>
-        <w:gridCol w:w="9026"/>
-      </w:tblGrid>
-      <w:tr>
-        <w:tblPrEx>
-          <w:tblBorders>
-            <w:top w:val="single" w:color="auto" w:sz="4" w:space="0"/>
-            <w:left w:val="single" w:color="auto" w:sz="4" w:space="0"/>
-            <w:bottom w:val="single" w:color="auto" w:sz="4" w:space="0"/>
-            <w:right w:val="single" w:color="auto" w:sz="4" w:space="0"/>
-            <w:insideH w:val="single" w:color="auto" w:sz="4" w:space="0"/>
-            <w:insideV w:val="single" w:color="auto" w:sz="4" w:space="0"/>
-          </w:tblBorders>
-          <w:tblCellMar>
-            <w:top w:w="0" w:type="dxa"/>
-            <w:left w:w="10" w:type="dxa"/>
-            <w:bottom w:w="0" w:type="dxa"/>
-            <w:right w:w="10" w:type="dxa"/>
-          </w:tblCellMar>
-        </w:tblPrEx>
-        <w:tc>
-          <w:tcPr>
-            <w:tcW w:w="9026" w:type="dxa"/>
-            <w:shd w:val="clear" w:color="auto" w:fill="FAFBFD"/>
-            <w:tcMar>
-              <w:top w:w="60" w:type="dxa"/>
-              <w:left w:w="120" w:type="dxa"/>
-              <w:bottom w:w="60" w:type="dxa"/>
-              <w:right w:w="120" w:type="dxa"/>
-            </w:tcMar>
-          </w:tcPr>
-          <w:p>
-            <w:pPr>
-              <w:rPr>
-                <w:lang w:eastAsia="zh-CN"/>
-              </w:rPr>
-            </w:pPr>
-            <w:r>
-              <w:rPr>
-                <w:lang w:eastAsia="zh-CN"/>
-              </w:rPr>
-              <w:t>Risk 1: LLM hallucinations and business</w:t>
-            </w:r>
-            <w:r>
-              <w:rPr>
-                <w:lang w:eastAsia="zh-CN"/>
-              </w:rPr>
-              <w:noBreakHyphen/>
-            </w:r>
-            <w:r>
-              <w:rPr>
-                <w:lang w:eastAsia="zh-CN"/>
-              </w:rPr>
-              <w:t>logic misunderstanding, producing factually wrong SQL. Mitigation: Add schema retrieval guardrails; validate generated SQL against basic syntax checks before execution.</w:t>
-            </w:r>
-          </w:p>
-          <w:p>
-            <w:pPr>
-              <w:rPr>
-                <w:lang w:eastAsia="zh-CN"/>
-              </w:rPr>
-            </w:pPr>
-            <w:r>
-              <w:rPr>
-                <w:lang w:eastAsia="zh-CN"/>
-              </w:rPr>
-              <w:t>Risk 2: Incorrect chart panel generation that misrepresents analytical results. Mitigation: Restrict chart types to a small predefined set for this prototype.</w:t>
-            </w:r>
-          </w:p>
-          <w:p>
-            <w:r>
-              <w:rPr>
-                <w:lang w:eastAsia="zh-CN"/>
-              </w:rPr>
-              <w:t>Limitation: This prototype is only validated on the selected Kaggle e</w:t>
-            </w:r>
-            <w:r>
-              <w:rPr>
-                <w:lang w:eastAsia="zh-CN"/>
-              </w:rPr>
-              <w:noBreakHyphen/>
-            </w:r>
-            <w:r>
-              <w:rPr>
-                <w:lang w:eastAsia="zh-CN"/>
-              </w:rPr>
-              <w:t>commerce dataset; performance will degrade when ported to unfamiliar databases.</w:t>
-            </w:r>
-          </w:p>
-        </w:tc>
-      </w:tr>
-    </w:tbl>
-    <w:p>
-      <w:pPr>
-        <w:spacing w:before="170" w:after="20"/>
-      </w:pPr>
-      <w:r>
-        <w:rPr>
-          <w:b/>
-          <w:bCs/>
-          <w:color w:val="1F3864"/>
-          <w:sz w:val="21"/>
-          <w:szCs w:val="21"/>
-        </w:rPr>
-        <w:t>9 · Smallest first version (optional)</w:t>
-      </w:r>
-    </w:p>
-    <w:p>
-      <w:pPr>
-        <w:spacing w:after="40"/>
-      </w:pPr>
-      <w:r>
-        <w:rPr>
-          <w:i/>
-          <w:iCs/>
-          <w:color w:val="595959"/>
-          <w:sz w:val="16"/>
-          <w:szCs w:val="16"/>
-        </w:rPr>
-        <w:t>The tiniest end-to-end slice you could build first.</w:t>
-      </w:r>
-    </w:p>
-    <w:tbl>
-      <w:tblPr>
-        <w:tblStyle w:val="12"/>
-        <w:tblW w:w="9026" w:type="dxa"/>
-        <w:tblInd w:w="0" w:type="dxa"/>
-        <w:tblBorders>
-          <w:top w:val="single" w:color="auto" w:sz="4" w:space="0"/>
-          <w:left w:val="single" w:color="auto" w:sz="4" w:space="0"/>
-          <w:bottom w:val="single" w:color="auto" w:sz="4" w:space="0"/>
-          <w:right w:val="single" w:color="auto" w:sz="4" w:space="0"/>
-          <w:insideH w:val="single" w:color="auto" w:sz="4" w:space="0"/>
-          <w:insideV w:val="single" w:color="auto" w:sz="4" w:space="0"/>
-        </w:tblBorders>
-        <w:tblLayout w:type="autofit"/>
-        <w:tblCellMar>
-          <w:top w:w="0" w:type="dxa"/>
-          <w:left w:w="10" w:type="dxa"/>
-          <w:bottom w:w="0" w:type="dxa"/>
-          <w:right w:w="10" w:type="dxa"/>
-        </w:tblCellMar>
-      </w:tblPr>
-      <w:tblGrid>
-        <w:gridCol w:w="9026"/>
-      </w:tblGrid>
-      <w:tr>
-        <w:tblPrEx>
-          <w:tblBorders>
-            <w:top w:val="single" w:color="auto" w:sz="4" w:space="0"/>
-            <w:left w:val="single" w:color="auto" w:sz="4" w:space="0"/>
-            <w:bottom w:val="single" w:color="auto" w:sz="4" w:space="0"/>
-            <w:right w:val="single" w:color="auto" w:sz="4" w:space="0"/>
-            <w:insideH w:val="single" w:color="auto" w:sz="4" w:space="0"/>
-            <w:insideV w:val="single" w:color="auto" w:sz="4" w:space="0"/>
-          </w:tblBorders>
-          <w:tblCellMar>
-            <w:top w:w="0" w:type="dxa"/>
-            <w:left w:w="10" w:type="dxa"/>
-            <w:bottom w:w="0" w:type="dxa"/>
-            <w:right w:w="10" w:type="dxa"/>
-          </w:tblCellMar>
-        </w:tblPrEx>
-        <w:tc>
-          <w:tcPr>
-            <w:tcW w:w="9026" w:type="dxa"/>
-            <w:shd w:val="clear" w:color="auto" w:fill="FAFBFD"/>
-            <w:tcMar>
-              <w:top w:w="60" w:type="dxa"/>
-              <w:left w:w="120" w:type="dxa"/>
-              <w:bottom w:w="60" w:type="dxa"/>
-              <w:right w:w="120" w:type="dxa"/>
-            </w:tcMar>
-          </w:tcPr>
-          <w:p/>
           <w:p/>
         </w:tc>
       </w:tr>
@@ -1325,7 +1337,6 @@
       <w:pPr>
         <w:spacing w:after="40"/>
       </w:pPr>
-      <w:bookmarkStart w:id="0" w:name="_GoBack"/>
       <w:r>
         <w:rPr>
           <w:sz w:val="18"/>
@@ -1334,7 +1345,6 @@
         <w:t>This milestone is not graded — it’s to give you fast, written feedback while there’s still time to change direction. A strong problem statement makes criteria 1 (problem &amp; significance) and 2 (business &amp; technical trade-offs) and helps you start on a strong footing. Bring questions during class breakouts or email the course account or WA text me</w:t>
       </w:r>
     </w:p>
-    <w:bookmarkEnd w:id="0"/>
     <w:p>
       <w:pPr>
         <w:pBdr>

</xml_diff>